<commit_message>
fix the Figure 3b project set in manuscript_numbers.py
figure3 panel b excludes dementia -- its source meta-analysis pools several
studies into one gold analysis, so per-analysis annotation cannot be scored
against it. manuscript_numbers.py omitted that filter and computed panel b over
all nine projects, which reported the annotation lift as 3.1x against the
figure's 3.3x.

This is the text-disagrees-with-its-own-figure failure the script exists to
prevent, and it produced a false correction: the stale-numbers table in
MANUSCRIPT.md claimed the planning documents' 3.3x was wrong. 3.3x was right.
That entry is corrected rather than deleted, so the false alarm is on the
record.

Panel a legitimately keeps all nine projects (dementia parses at 100%); only
panel b drops it. With the filter applied, panel b is n=8: pooled precision
0.540, recall 0.809, lift mean 3.3x, range 1.8-5.6, and 28 target contrasts.

Co-Authored-By: Claude Opus 5 <noreply@anthropic.com>
</commit_message>
<xml_diff>
--- a/MANUSCRIPT.docx
+++ b/MANUSCRIPT.docx
@@ -9047,6 +9047,9 @@
               <w:jc w:val="left"/>
             </w:pPr>
             <w:r>
+              <w:rPr>
+                <w:strike/>
+              </w:rPr>
               <w:t xml:space="preserve">annotation lift 3.3×</w:t>
             </w:r>
           </w:p>
@@ -9063,7 +9066,13 @@
                 <w:bCs/>
                 <w:b/>
               </w:rPr>
-              <w:t xml:space="preserve">3.1×</w:t>
+              <w:t xml:space="preserve">3.3× is correct</w:t>
+            </w:r>
+            <w:r>
+              <w:t xml:space="preserve"> </w:t>
+            </w:r>
+            <w:r>
+              <w:t xml:space="preserve">— my 3.1× included dementia, which Fig 3b excludes</w:t>
             </w:r>
           </w:p>
         </w:tc>

</xml_diff>

<commit_message>
Figure 2: precision leads, attainable recall second
Panels swapped. Precision is the claim Result 2 makes; the recall panel is the
control that makes it interpretable rather than a finding in its own right, so
the reader should meet them in that order.

The output stem stated the old order, so it is renamed
figure2_attainable_recall_and_precision -> figure2_precision_and_attainable_recall.
The caption, the module docstring, the figure map in that docstring and the
pointer in PAPER_OUTLINE.md all follow; no stale references to the old stem
remain anywhere outside reports/.

Nothing about the data changed -- same panels, same numbers, same nine
projects. Only the reading order.

Co-Authored-By: Claude Opus 5 <noreply@anthropic.com>
</commit_message>
<xml_diff>
--- a/MANUSCRIPT.docx
+++ b/MANUSCRIPT.docx
@@ -7813,6 +7813,25 @@
         <w:t xml:space="preserve">a</w:t>
       </w:r>
       <w:r>
+        <w:t xml:space="preserve">, Precision, the proportion of retained articles present in the expert inclusion</w:t>
+      </w:r>
+      <w:r>
+        <w:t xml:space="preserve"> </w:t>
+      </w:r>
+      <w:r>
+        <w:t xml:space="preserve">list, at each stage of the workflow.</w:t>
+      </w:r>
+      <w:r>
+        <w:t xml:space="preserve"> </w:t>
+      </w:r>
+      <w:r>
+        <w:rPr>
+          <w:bCs/>
+          <w:b/>
+        </w:rPr>
+        <w:t xml:space="preserve">b</w:t>
+      </w:r>
+      <w:r>
         <w:t xml:space="preserve">, Recall at each stage, computed against an</w:t>
       </w:r>
       <w:r>
@@ -7829,50 +7848,25 @@
         <w:t xml:space="preserve"> </w:t>
       </w:r>
       <w:r>
-        <w:t xml:space="preserve">denominator: at each</w:t>
-      </w:r>
-      <w:r>
-        <w:t xml:space="preserve"> </w:t>
-      </w:r>
-      <w:r>
-        <w:t xml:space="preserve">stage the denominator drops the studies that became unavailable there — not returned by the</w:t>
-      </w:r>
-      <w:r>
-        <w:t xml:space="preserve"> </w:t>
-      </w:r>
-      <w:r>
-        <w:t xml:space="preserve">search, no usable full text, or no parseable coordinates — and never drops a study that was</w:t>
-      </w:r>
-      <w:r>
-        <w:t xml:space="preserve"> </w:t>
-      </w:r>
-      <w:r>
-        <w:t xml:space="preserve">rejected on judgement. The search stage is therefore 1.000 by construction, being a pure</w:t>
-      </w:r>
-      <w:r>
-        <w:t xml:space="preserve"> </w:t>
-      </w:r>
-      <w:r>
-        <w:t xml:space="preserve">availability stage.</w:t>
-      </w:r>
-      <w:r>
-        <w:t xml:space="preserve"> </w:t>
-      </w:r>
-      <w:r>
-        <w:rPr>
-          <w:bCs/>
-          <w:b/>
-        </w:rPr>
-        <w:t xml:space="preserve">b</w:t>
-      </w:r>
-      <w:r>
-        <w:t xml:space="preserve">, Precision, the proportion of retained articles present in the expert</w:t>
-      </w:r>
-      <w:r>
-        <w:t xml:space="preserve"> </w:t>
-      </w:r>
-      <w:r>
-        <w:t xml:space="preserve">inclusion list. Each line is one project (</w:t>
+        <w:t xml:space="preserve">denominator: at each stage the denominator drops the studies that became unavailable</w:t>
+      </w:r>
+      <w:r>
+        <w:t xml:space="preserve"> </w:t>
+      </w:r>
+      <w:r>
+        <w:t xml:space="preserve">there — not returned by the search, no usable full text, or no parseable coordinates — and never</w:t>
+      </w:r>
+      <w:r>
+        <w:t xml:space="preserve"> </w:t>
+      </w:r>
+      <w:r>
+        <w:t xml:space="preserve">drops a study that was rejected on judgement. The search stage is therefore 1.000 by</w:t>
+      </w:r>
+      <w:r>
+        <w:t xml:space="preserve"> </w:t>
+      </w:r>
+      <w:r>
+        <w:t xml:space="preserve">construction, being a pure availability stage. Each line is one project (</w:t>
       </w:r>
       <w:r>
         <w:rPr>
@@ -7885,29 +7879,29 @@
         <w:t xml:space="preserve"> </w:t>
       </w:r>
       <w:r>
-        <w:t xml:space="preserve">= 9); the heavy black line is the cross-project</w:t>
-      </w:r>
-      <w:r>
-        <w:t xml:space="preserve"> </w:t>
-      </w:r>
-      <w:r>
-        <w:t xml:space="preserve">mean. Because availability losses leave the denominator but screening decisions do not, the</w:t>
-      </w:r>
-      <w:r>
-        <w:t xml:space="preserve"> </w:t>
-      </w:r>
-      <w:r>
-        <w:t xml:space="preserve">decline in</w:t>
-      </w:r>
-      <w:r>
-        <w:t xml:space="preserve"> </w:t>
-      </w:r>
-      <w:r>
-        <w:rPr>
-          <w:bCs/>
-          <w:b/>
-        </w:rPr>
-        <w:t xml:space="preserve">a</w:t>
+        <w:t xml:space="preserve">= 9); the heavy black</w:t>
+      </w:r>
+      <w:r>
+        <w:t xml:space="preserve"> </w:t>
+      </w:r>
+      <w:r>
+        <w:t xml:space="preserve">line is the cross-project mean. Because availability losses leave the denominator but screening</w:t>
+      </w:r>
+      <w:r>
+        <w:t xml:space="preserve"> </w:t>
+      </w:r>
+      <w:r>
+        <w:t xml:space="preserve">decisions do not, the decline in</w:t>
+      </w:r>
+      <w:r>
+        <w:t xml:space="preserve"> </w:t>
+      </w:r>
+      <w:r>
+        <w:rPr>
+          <w:bCs/>
+          <w:b/>
+        </w:rPr>
+        <w:t xml:space="preserve">b</w:t>
       </w:r>
       <w:r>
         <w:t xml:space="preserve"> </w:t>

</xml_diff>

<commit_message>
Figure 2: drop the grey in-panel note, move its content to the caption
The note carried three things beyond decoration: the denominator rule, the
corpus ceiling (the search returned a mean 86% of expert-included studies,
range 60-96%) and the raw-denominator comparison (0.48 at analysis selection
against 0.82 attainable). Deleting it outright would have lost the last two,
which appeared nowhere else, so both are now in the caption and verified
against the CSV.

The computation stays in the figure code and prints the two values on every
build, so the caption can be re-checked without digging, and so it is obvious
what the panel used to say.

Four other figures still carry grey explainer text -- Fig. 4 "above the line =
pipeline better", Fig. 3 "open marker = same-size random draw", S1 "open circle
= one run registered at several tiers", S5 "output dominates the cheap stage".
Left alone; this change was scoped to Figure 2.

Co-Authored-By: Claude Opus 5 <noreply@anthropic.com>
</commit_message>
<xml_diff>
--- a/MANUSCRIPT.docx
+++ b/MANUSCRIPT.docx
@@ -7866,7 +7866,19 @@
         <w:t xml:space="preserve"> </w:t>
       </w:r>
       <w:r>
-        <w:t xml:space="preserve">construction, being a pure availability stage. Each line is one project (</w:t>
+        <w:t xml:space="preserve">construction, being a pure availability stage; the PubMed search returned a mean of 86% of the</w:t>
+      </w:r>
+      <w:r>
+        <w:t xml:space="preserve"> </w:t>
+      </w:r>
+      <w:r>
+        <w:t xml:space="preserve">expert-included studies (range 60–96%), and that ceiling is the quantity the denominator removes.</w:t>
+      </w:r>
+      <w:r>
+        <w:t xml:space="preserve"> </w:t>
+      </w:r>
+      <w:r>
+        <w:t xml:space="preserve">Each line is one project (</w:t>
       </w:r>
       <w:r>
         <w:rPr>
@@ -7879,19 +7891,13 @@
         <w:t xml:space="preserve"> </w:t>
       </w:r>
       <w:r>
-        <w:t xml:space="preserve">= 9); the heavy black</w:t>
-      </w:r>
-      <w:r>
-        <w:t xml:space="preserve"> </w:t>
-      </w:r>
-      <w:r>
-        <w:t xml:space="preserve">line is the cross-project mean. Because availability losses leave the denominator but screening</w:t>
-      </w:r>
-      <w:r>
-        <w:t xml:space="preserve"> </w:t>
-      </w:r>
-      <w:r>
-        <w:t xml:space="preserve">decisions do not, the decline in</w:t>
+        <w:t xml:space="preserve">= 9); the heavy black line is the cross-project mean. Because</w:t>
+      </w:r>
+      <w:r>
+        <w:t xml:space="preserve"> </w:t>
+      </w:r>
+      <w:r>
+        <w:t xml:space="preserve">availability losses leave the denominator but screening decisions do not, the decline in</w:t>
       </w:r>
       <w:r>
         <w:t xml:space="preserve"> </w:t>
@@ -7907,7 +7913,19 @@
         <w:t xml:space="preserve"> </w:t>
       </w:r>
       <w:r>
-        <w:t xml:space="preserve">is attributable to eligibility judgements alone.</w:t>
+        <w:t xml:space="preserve">is</w:t>
+      </w:r>
+      <w:r>
+        <w:t xml:space="preserve"> </w:t>
+      </w:r>
+      <w:r>
+        <w:t xml:space="preserve">attributable to eligibility judgements alone. Scored instead against every expert-included study,</w:t>
+      </w:r>
+      <w:r>
+        <w:t xml:space="preserve"> </w:t>
+      </w:r>
+      <w:r>
+        <w:t xml:space="preserve">recall at analysis selection reads 0.48 rather than 0.82.</w:t>
       </w:r>
     </w:p>
     <w:p>

</xml_diff>

<commit_message>
decomposition figure: professional panel titles, larger markers
"gain from choosing papers" read as lab shorthand. The panels each isolate the
contribution of one selection step, so the titles now name the step:
"Contribution of article selection" and "Contribution of analysis selection".
"Article" rather than "paper" matches the manuscript, and "analysis selection"
matches the stage name now used in Figs 2 and 3.

Axis labels follow: "Search-only baseline", "Article screening only", "Full
pipeline". The chain is now readable across panels -- panel a's y axis is panel
b's x axis -- which the previous "Screening only" did not make obvious.

Markers enlarged from s=15 to s=26 with a slightly heavier white edge, and the
legend swatches from 3.2 to 3.8, since at 28 points per panel the old size read
as noise rather than data.

Caption updated to match, and now says what a marker is: one target contrast,
coloured by project.

Co-Authored-By: Claude Opus 5 <noreply@anthropic.com>
</commit_message>
<xml_diff>
--- a/MANUSCRIPT.docx
+++ b/MANUSCRIPT.docx
@@ -7553,7 +7553,7 @@
       </w:r>
     </w:p>
     <w:bookmarkEnd w:id="41"/>
-    <w:bookmarkStart w:id="42" w:name="figure-legends"/>
+    <w:bookmarkStart w:id="46" w:name="figure-legends"/>
     <w:p>
       <w:pPr>
         <w:pStyle w:val="Heading1"/>
@@ -8346,321 +8346,96 @@
         <w:t xml:space="preserve"> </w:t>
       </w:r>
       <w:r>
-        <w:t xml:space="preserve">over the same 28 contrasts, all from the same pipeline run: the search-only baseline; a</w:t>
-      </w:r>
-      <w:r>
-        <w:t xml:space="preserve"> </w:t>
-      </w:r>
-      <w:r>
-        <w:t xml:space="preserve">screening-only arm that applies article-level eligibility criteria and then pools every parsed</w:t>
-      </w:r>
-      <w:r>
-        <w:t xml:space="preserve"> </w:t>
-      </w:r>
-      <w:r>
-        <w:t xml:space="preserve">analysis from the retained articles; and the full pipeline, which additionally selects analyses per</w:t>
-      </w:r>
-      <w:r>
-        <w:t xml:space="preserve"> </w:t>
-      </w:r>
-      <w:r>
-        <w:t xml:space="preserve">contrast. Each panel plots one arm against the next, so points above the identity line are</w:t>
-      </w:r>
-      <w:r>
-        <w:t xml:space="preserve"> </w:t>
-      </w:r>
-      <w:r>
-        <w:t xml:space="preserve">contrasts where that step gained; the middle arm isolates the contribution of article screening. Mean gains are additive</w:t>
-      </w:r>
-      <w:r>
-        <w:t xml:space="preserve"> </w:t>
-      </w:r>
-      <w:r>
-        <w:t xml:space="preserve">and sum to the total margin in Fig. 4 (+0.005 from article screening, +0.109 from analysis</w:t>
-      </w:r>
-      <w:r>
-        <w:t xml:space="preserve"> </w:t>
-      </w:r>
-      <w:r>
-        <w:t xml:space="preserve">selection, +0.114 in total), so 96% of the advantage is attributable to selection within articles.</w:t>
-      </w:r>
-    </w:p>
-    <w:bookmarkEnd w:id="42"/>
-    <w:bookmarkStart w:id="47" w:name="supplementary-information"/>
-    <w:p>
-      <w:pPr>
-        <w:pStyle w:val="Heading1"/>
-      </w:pPr>
-      <w:r>
-        <w:t xml:space="preserve">Supplementary Information</w:t>
-      </w:r>
-    </w:p>
-    <w:p>
-      <w:pPr>
-        <w:pStyle w:val="BlockText"/>
-      </w:pPr>
-      <w:r>
-        <w:rPr>
-          <w:bCs/>
-          <w:b/>
-        </w:rPr>
-        <w:t xml:space="preserve">BRIEF</w:t>
-      </w:r>
-      <w:r>
-        <w:t xml:space="preserve"> </w:t>
-      </w:r>
-      <w:r>
-        <w:t xml:space="preserve">— renumbered 2026-09-17:</w:t>
-      </w:r>
-    </w:p>
-    <w:p>
-      <w:pPr>
-        <w:numPr>
-          <w:ilvl w:val="0"/>
-          <w:numId w:val="1016"/>
-        </w:numPr>
-        <w:pStyle w:val="Compact"/>
-      </w:pPr>
-      <w:r>
-        <w:rPr>
-          <w:bCs/>
-          <w:b/>
-        </w:rPr>
-        <w:t xml:space="preserve">S1</w:t>
-      </w:r>
-      <w:r>
-        <w:t xml:space="preserve"> </w:t>
-      </w:r>
-      <w:r>
-        <w:t xml:space="preserve">criteria tier progression — mis-specification vs overfitting (</w:t>
-      </w:r>
-      <w:r>
-        <w:rPr>
-          <w:rStyle w:val="VerbatimChar"/>
-        </w:rPr>
-        <w:t xml:space="preserve">--only S1</w:t>
-      </w:r>
-      <w:r>
-        <w:t xml:space="preserve">)</w:t>
-      </w:r>
-    </w:p>
-    <w:p>
-      <w:pPr>
-        <w:numPr>
-          <w:ilvl w:val="0"/>
-          <w:numId w:val="1016"/>
-        </w:numPr>
-        <w:pStyle w:val="Compact"/>
-      </w:pPr>
-      <w:r>
-        <w:rPr>
-          <w:bCs/>
-          <w:b/>
-        </w:rPr>
-        <w:t xml:space="preserve">S2</w:t>
-      </w:r>
-      <w:r>
-        <w:t xml:space="preserve"> </w:t>
-      </w:r>
-      <w:r>
-        <w:t xml:space="preserve">pool mismatch (</w:t>
-      </w:r>
-      <w:r>
-        <w:rPr>
-          <w:rStyle w:val="VerbatimChar"/>
-        </w:rPr>
-        <w:t xml:space="preserve">--only S2</w:t>
-      </w:r>
-      <w:r>
-        <w:t xml:space="preserve">)</w:t>
-      </w:r>
-    </w:p>
-    <w:p>
-      <w:pPr>
-        <w:numPr>
-          <w:ilvl w:val="0"/>
-          <w:numId w:val="1016"/>
-        </w:numPr>
-        <w:pStyle w:val="Compact"/>
-      </w:pPr>
-      <w:r>
-        <w:rPr>
-          <w:bCs/>
-          <w:b/>
-        </w:rPr>
-        <w:t xml:space="preserve">S3</w:t>
-      </w:r>
-      <w:r>
-        <w:t xml:space="preserve"> </w:t>
-      </w:r>
-      <w:r>
-        <w:t xml:space="preserve">size-matched null (</w:t>
-      </w:r>
-      <w:r>
-        <w:rPr>
-          <w:rStyle w:val="VerbatimChar"/>
-        </w:rPr>
-        <w:t xml:space="preserve">--only S3</w:t>
-      </w:r>
-      <w:r>
-        <w:t xml:space="preserve">)</w:t>
-      </w:r>
-    </w:p>
-    <w:p>
-      <w:pPr>
-        <w:numPr>
-          <w:ilvl w:val="0"/>
-          <w:numId w:val="1016"/>
-        </w:numPr>
-        <w:pStyle w:val="Compact"/>
-      </w:pPr>
-      <w:r>
-        <w:rPr>
-          <w:bCs/>
-          <w:b/>
-        </w:rPr>
-        <w:t xml:space="preserve">S4</w:t>
-      </w:r>
-      <w:r>
-        <w:t xml:space="preserve"> </w:t>
-      </w:r>
-      <w:r>
-        <w:t xml:space="preserve">brain maps, all columns (</w:t>
-      </w:r>
-      <w:r>
-        <w:rPr>
-          <w:rStyle w:val="VerbatimChar"/>
-        </w:rPr>
-        <w:t xml:space="preserve">--only S4</w:t>
-      </w:r>
-      <w:r>
-        <w:t xml:space="preserve">; shells out to</w:t>
-      </w:r>
-      <w:r>
-        <w:t xml:space="preserve"> </w:t>
-      </w:r>
-      <w:r>
-        <w:rPr>
-          <w:rStyle w:val="VerbatimChar"/>
-        </w:rPr>
-        <w:t xml:space="preserve">scripts/make_brain_map_figure.py</w:t>
-      </w:r>
-      <w:r>
-        <w:t xml:space="preserve"> </w:t>
-      </w:r>
-      <w:r>
-        <w:t xml:space="preserve">under system python3 and takes ~2 min, so a full</w:t>
-      </w:r>
-      <w:r>
-        <w:t xml:space="preserve"> </w:t>
-      </w:r>
-      <w:r>
-        <w:t xml:space="preserve">figure rebuild reports it and skips it)</w:t>
-      </w:r>
-    </w:p>
-    <w:p>
-      <w:pPr>
-        <w:numPr>
-          <w:ilvl w:val="0"/>
-          <w:numId w:val="1016"/>
-        </w:numPr>
-        <w:pStyle w:val="Compact"/>
-      </w:pPr>
-      <w:r>
-        <w:rPr>
-          <w:bCs/>
-          <w:b/>
-        </w:rPr>
-        <w:t xml:space="preserve">S5</w:t>
-      </w:r>
-      <w:r>
-        <w:t xml:space="preserve"> </w:t>
-      </w:r>
-      <w:r>
-        <w:t xml:space="preserve">measured cost per stage (</w:t>
-      </w:r>
-      <w:r>
-        <w:rPr>
-          <w:rStyle w:val="VerbatimChar"/>
-        </w:rPr>
-        <w:t xml:space="preserve">--only S5</w:t>
-      </w:r>
-      <w:r>
-        <w:t xml:space="preserve">)</w:t>
-      </w:r>
-    </w:p>
-    <w:p>
-      <w:pPr>
-        <w:pStyle w:val="BlockText"/>
-      </w:pPr>
-      <w:r>
-        <w:t xml:space="preserve">Three figures are still built and still correct but no longer cited, so they carry</w:t>
-      </w:r>
-      <w:r>
-        <w:t xml:space="preserve"> </w:t>
-      </w:r>
-      <w:r>
-        <w:t xml:space="preserve">descriptive keys rather than S-numbers:</w:t>
-      </w:r>
-      <w:r>
-        <w:t xml:space="preserve"> </w:t>
-      </w:r>
-      <w:r>
-        <w:rPr>
-          <w:rStyle w:val="VerbatimChar"/>
-        </w:rPr>
-        <w:t xml:space="preserve">--only text2map</w:t>
-      </w:r>
-      <w:r>
-        <w:t xml:space="preserve"> </w:t>
-      </w:r>
-      <w:r>
-        <w:t xml:space="preserve">(text-to-map baselines),</w:t>
-      </w:r>
-      <w:r>
-        <w:t xml:space="preserve"> </w:t>
-      </w:r>
-      <w:r>
-        <w:rPr>
-          <w:rStyle w:val="VerbatimChar"/>
-        </w:rPr>
-        <w:t xml:space="preserve">--only retention</w:t>
-      </w:r>
-      <w:r>
-        <w:t xml:space="preserve"> </w:t>
-      </w:r>
-      <w:r>
-        <w:t xml:space="preserve">(raw-denominator gold retention) and</w:t>
-      </w:r>
-      <w:r>
-        <w:t xml:space="preserve"> </w:t>
-      </w:r>
-      <w:r>
-        <w:rPr>
-          <w:rStyle w:val="VerbatimChar"/>
-        </w:rPr>
-        <w:t xml:space="preserve">--only annotationpr</w:t>
-      </w:r>
-      <w:r>
-        <w:t xml:space="preserve"> </w:t>
-      </w:r>
-      <w:r>
-        <w:t xml:space="preserve">(annotation in precision-recall space). Extended Data: the §3 cautionary case,</w:t>
-      </w:r>
-      <w:r>
-        <w:t xml:space="preserve"> </w:t>
-      </w:r>
-      <w:r>
-        <w:t xml:space="preserve">per-project tables behind Figures 2–5, PRISMA funnels.</w:t>
-      </w:r>
-      <w:r>
-        <w:t xml:space="preserve"> </w:t>
-      </w:r>
-      <w:r>
-        <w:t xml:space="preserve">Extended Data: the §3 cautionary case, per-project tables behind Figures 2–5, PRISMA funnels.</w:t>
-      </w:r>
-    </w:p>
-    <w:bookmarkStart w:id="43" w:name="supplementary-figure-legends"/>
+        <w:t xml:space="preserve">over the same 28 target contrasts, all from the same pipeline run: a search-only baseline; an</w:t>
+      </w:r>
+      <w:r>
+        <w:t xml:space="preserve"> </w:t>
+      </w:r>
+      <w:r>
+        <w:t xml:space="preserve">article-screening-only arm, which applies article-level eligibility criteria and then pools every</w:t>
+      </w:r>
+      <w:r>
+        <w:t xml:space="preserve"> </w:t>
+      </w:r>
+      <w:r>
+        <w:t xml:space="preserve">parsed analysis from the retained articles; and the full pipeline, which additionally selects</w:t>
+      </w:r>
+      <w:r>
+        <w:t xml:space="preserve"> </w:t>
+      </w:r>
+      <w:r>
+        <w:t xml:space="preserve">analyses against contrast-specific criteria.</w:t>
+      </w:r>
+      <w:r>
+        <w:t xml:space="preserve"> </w:t>
+      </w:r>
+      <w:r>
+        <w:rPr>
+          <w:bCs/>
+          <w:b/>
+        </w:rPr>
+        <w:t xml:space="preserve">a</w:t>
+      </w:r>
+      <w:r>
+        <w:t xml:space="preserve">, Article screening against the search-only</w:t>
+      </w:r>
+      <w:r>
+        <w:t xml:space="preserve"> </w:t>
+      </w:r>
+      <w:r>
+        <w:t xml:space="preserve">baseline, isolating the contribution of selecting articles.</w:t>
+      </w:r>
+      <w:r>
+        <w:t xml:space="preserve"> </w:t>
+      </w:r>
+      <w:r>
+        <w:rPr>
+          <w:bCs/>
+          <w:b/>
+        </w:rPr>
+        <w:t xml:space="preserve">b</w:t>
+      </w:r>
+      <w:r>
+        <w:t xml:space="preserve">, The full pipeline against</w:t>
+      </w:r>
+      <w:r>
+        <w:t xml:space="preserve"> </w:t>
+      </w:r>
+      <w:r>
+        <w:t xml:space="preserve">article screening alone, isolating the contribution of selecting analyses within them. Each</w:t>
+      </w:r>
+      <w:r>
+        <w:t xml:space="preserve"> </w:t>
+      </w:r>
+      <w:r>
+        <w:t xml:space="preserve">marker is one target contrast and colour identifies the project; markers above the identity line</w:t>
+      </w:r>
+      <w:r>
+        <w:t xml:space="preserve"> </w:t>
+      </w:r>
+      <w:r>
+        <w:t xml:space="preserve">are contrasts where that step improved correspondence with the reference map. Mean gains are</w:t>
+      </w:r>
+      <w:r>
+        <w:t xml:space="preserve"> </w:t>
+      </w:r>
+      <w:r>
+        <w:t xml:space="preserve">additive and sum to the total margin in Fig. 4 — +0.005 from article selection, +0.109 from</w:t>
+      </w:r>
+      <w:r>
+        <w:t xml:space="preserve"> </w:t>
+      </w:r>
+      <w:r>
+        <w:t xml:space="preserve">analysis selection, +0.114 in total — so 96% of the advantage is attributable to selection within</w:t>
+      </w:r>
+      <w:r>
+        <w:t xml:space="preserve"> </w:t>
+      </w:r>
+      <w:r>
+        <w:t xml:space="preserve">articles.</w:t>
+      </w:r>
+    </w:p>
+    <w:bookmarkStart w:id="42" w:name="supplementary-figure-legends"/>
     <w:p>
       <w:pPr>
         <w:pStyle w:val="Heading2"/>
@@ -9239,8 +9014,8 @@
         <w:t xml:space="preserve">per call, because the stages differ by an order of magnitude in how many calls they make.</w:t>
       </w:r>
     </w:p>
-    <w:bookmarkEnd w:id="43"/>
-    <w:bookmarkStart w:id="44" w:name="X0e6005aef2dc115b03ca4b74639a0a6de9b6771"/>
+    <w:bookmarkEnd w:id="42"/>
+    <w:bookmarkStart w:id="43" w:name="X0e6005aef2dc115b03ca4b74639a0a6de9b6771"/>
     <w:p>
       <w:pPr>
         <w:pStyle w:val="Heading2"/>
@@ -9768,8 +9543,8 @@
         <w:t xml:space="preserve">).</w:t>
       </w:r>
     </w:p>
-    <w:bookmarkEnd w:id="44"/>
-    <w:bookmarkStart w:id="45" w:name="X20ef6d18cd9fc96b08bb2fa517724e5662b38ba"/>
+    <w:bookmarkEnd w:id="43"/>
+    <w:bookmarkStart w:id="44" w:name="X20ef6d18cd9fc96b08bb2fa517724e5662b38ba"/>
     <w:p>
       <w:pPr>
         <w:pStyle w:val="Heading2"/>
@@ -10062,8 +9837,8 @@
         <w:t xml:space="preserve">).</w:t>
       </w:r>
     </w:p>
-    <w:bookmarkEnd w:id="45"/>
-    <w:bookmarkStart w:id="46" w:name="Xc2afe02dafd829f6838eb6ad6997c3a25bf69f0"/>
+    <w:bookmarkEnd w:id="44"/>
+    <w:bookmarkStart w:id="45" w:name="Xc2afe02dafd829f6838eb6ad6997c3a25bf69f0"/>
     <w:p>
       <w:pPr>
         <w:pStyle w:val="Heading2"/>
@@ -10351,9 +10126,9 @@
         </w:pict>
       </w:r>
     </w:p>
+    <w:bookmarkEnd w:id="45"/>
     <w:bookmarkEnd w:id="46"/>
-    <w:bookmarkEnd w:id="47"/>
-    <w:bookmarkStart w:id="51" w:name="scaffolding-delete-before-submission"/>
+    <w:bookmarkStart w:id="50" w:name="scaffolding-delete-before-submission"/>
     <w:p>
       <w:pPr>
         <w:pStyle w:val="Heading1"/>
@@ -10362,7 +10137,7 @@
         <w:t xml:space="preserve">SCAFFOLDING — DELETE BEFORE SUBMISSION</w:t>
       </w:r>
     </w:p>
-    <w:bookmarkStart w:id="48" w:name="what-actually-gates-submission"/>
+    <w:bookmarkStart w:id="47" w:name="what-actually-gates-submission"/>
     <w:p>
       <w:pPr>
         <w:pStyle w:val="Heading2"/>
@@ -10749,8 +10524,8 @@
         </w:tc>
       </w:tr>
     </w:tbl>
-    <w:bookmarkEnd w:id="48"/>
-    <w:bookmarkStart w:id="49" w:name="Xc84be1fa92a3fedf0e0c786c93674ef5776eca8"/>
+    <w:bookmarkEnd w:id="47"/>
+    <w:bookmarkStart w:id="48" w:name="Xc84be1fa92a3fedf0e0c786c93674ef5776eca8"/>
     <w:p>
       <w:pPr>
         <w:pStyle w:val="Heading2"/>
@@ -11186,51 +10961,51 @@
         <w:t xml:space="preserve">.</w:t>
       </w:r>
     </w:p>
+    <w:bookmarkEnd w:id="48"/>
+    <w:bookmarkStart w:id="49" w:name="budget-arithmetic"/>
+    <w:p>
+      <w:pPr>
+        <w:pStyle w:val="Heading2"/>
+      </w:pPr>
+      <w:r>
+        <w:t xml:space="preserve">Budget arithmetic</w:t>
+      </w:r>
+    </w:p>
+    <w:p>
+      <w:pPr>
+        <w:pStyle w:val="FirstParagraph"/>
+      </w:pPr>
+      <w:r>
+        <w:t xml:space="preserve">Skeleton budget: 150 + 350 + 1,900 + 600 = 3,000. Per-heading Results totals are</w:t>
+      </w:r>
+      <w:r>
+        <w:t xml:space="preserve"> </w:t>
+      </w:r>
+      <w:r>
+        <w:t xml:space="preserve">300 + 300 + 350 + 350 + 350 + 200 =</w:t>
+      </w:r>
+      <w:r>
+        <w:t xml:space="preserve"> </w:t>
+      </w:r>
+      <w:r>
+        <w:rPr>
+          <w:bCs/>
+          <w:b/>
+        </w:rPr>
+        <w:t xml:space="preserve">1,850</w:t>
+      </w:r>
+      <w:r>
+        <w:t xml:space="preserve">, i.e. 50 short of the stated 1,900. Result 6’s</w:t>
+      </w:r>
+      <w:r>
+        <w:t xml:space="preserve"> </w:t>
+      </w:r>
+      <w:r>
+        <w:t xml:space="preserve">heading (~200 w) also disagrees with the budget table (~300). Settle before writing to length.</w:t>
+      </w:r>
+    </w:p>
     <w:bookmarkEnd w:id="49"/>
-    <w:bookmarkStart w:id="50" w:name="budget-arithmetic"/>
-    <w:p>
-      <w:pPr>
-        <w:pStyle w:val="Heading2"/>
-      </w:pPr>
-      <w:r>
-        <w:t xml:space="preserve">Budget arithmetic</w:t>
-      </w:r>
-    </w:p>
-    <w:p>
-      <w:pPr>
-        <w:pStyle w:val="FirstParagraph"/>
-      </w:pPr>
-      <w:r>
-        <w:t xml:space="preserve">Skeleton budget: 150 + 350 + 1,900 + 600 = 3,000. Per-heading Results totals are</w:t>
-      </w:r>
-      <w:r>
-        <w:t xml:space="preserve"> </w:t>
-      </w:r>
-      <w:r>
-        <w:t xml:space="preserve">300 + 300 + 350 + 350 + 350 + 200 =</w:t>
-      </w:r>
-      <w:r>
-        <w:t xml:space="preserve"> </w:t>
-      </w:r>
-      <w:r>
-        <w:rPr>
-          <w:bCs/>
-          <w:b/>
-        </w:rPr>
-        <w:t xml:space="preserve">1,850</w:t>
-      </w:r>
-      <w:r>
-        <w:t xml:space="preserve">, i.e. 50 short of the stated 1,900. Result 6’s</w:t>
-      </w:r>
-      <w:r>
-        <w:t xml:space="preserve"> </w:t>
-      </w:r>
-      <w:r>
-        <w:t xml:space="preserve">heading (~200 w) also disagrees with the budget table (~300). Settle before writing to length.</w:t>
-      </w:r>
-    </w:p>
     <w:bookmarkEnd w:id="50"/>
-    <w:bookmarkEnd w:id="51"/>
     <w:sectPr/>
   </w:body>
 </w:document>
@@ -11598,9 +11373,6 @@
     <w:abstractNumId w:val="991"/>
   </w:num>
   <w:num w:numId="1015">
-    <w:abstractNumId w:val="991"/>
-  </w:num>
-  <w:num w:numId="1016">
     <w:abstractNumId w:val="991"/>
   </w:num>
 </w:numbering>

</xml_diff>

<commit_message>
decomposition panel titles name the arm, not the contribution
"Article selection only" for panel a, "Article + analysis selection" for b.

Panel b is deliberately NOT "analysis selection only". Its y arm is the full
pipeline, which selects articles and analyses; only the increment over panel
a's arm is analysis selection. Labelling it "only" would mislabel the arm.

It would also collide with the Results text, which already uses
"analysis-selection-only" for a different condition -- the annotation-only arm,
which starts from the expert inclusion list and skips screening entirely. Two
designs under one name in the same paper is the kind of thing a reader resolves
incorrectly and silently.

The caption now says explicitly that the titles name the y-axis arm, and
distinguishes panel b from the analysis-selection-only arm described in
Results.

Co-Authored-By: Claude Opus 5 <noreply@anthropic.com>
</commit_message>
<xml_diff>
--- a/MANUSCRIPT.docx
+++ b/MANUSCRIPT.docx
@@ -8377,13 +8377,13 @@
         <w:t xml:space="preserve">a</w:t>
       </w:r>
       <w:r>
-        <w:t xml:space="preserve">, Article screening against the search-only</w:t>
-      </w:r>
-      <w:r>
-        <w:t xml:space="preserve"> </w:t>
-      </w:r>
-      <w:r>
-        <w:t xml:space="preserve">baseline, isolating the contribution of selecting articles.</w:t>
+        <w:t xml:space="preserve">, Article selection only, against the</w:t>
+      </w:r>
+      <w:r>
+        <w:t xml:space="preserve"> </w:t>
+      </w:r>
+      <w:r>
+        <w:t xml:space="preserve">search-only baseline: the increment is the contribution of selecting articles.</w:t>
       </w:r>
       <w:r>
         <w:t xml:space="preserve"> </w:t>
@@ -8396,13 +8396,63 @@
         <w:t xml:space="preserve">b</w:t>
       </w:r>
       <w:r>
-        <w:t xml:space="preserve">, The full pipeline against</w:t>
-      </w:r>
-      <w:r>
-        <w:t xml:space="preserve"> </w:t>
-      </w:r>
-      <w:r>
-        <w:t xml:space="preserve">article screening alone, isolating the contribution of selecting analyses within them. Each</w:t>
+        <w:t xml:space="preserve">, Article and</w:t>
+      </w:r>
+      <w:r>
+        <w:t xml:space="preserve"> </w:t>
+      </w:r>
+      <w:r>
+        <w:t xml:space="preserve">analysis selection together, against article selection alone: the increment is the contribution</w:t>
+      </w:r>
+      <w:r>
+        <w:t xml:space="preserve"> </w:t>
+      </w:r>
+      <w:r>
+        <w:t xml:space="preserve">of selecting analyses within the retained articles. Panel titles name the arm plotted on the</w:t>
+      </w:r>
+      <w:r>
+        <w:t xml:space="preserve"> </w:t>
+      </w:r>
+      <w:r>
+        <w:rPr>
+          <w:iCs/>
+          <w:i/>
+        </w:rPr>
+        <w:t xml:space="preserve">y</w:t>
+      </w:r>
+      <w:r>
+        <w:t xml:space="preserve"> </w:t>
+      </w:r>
+      <w:r>
+        <w:t xml:space="preserve">axis, so</w:t>
+      </w:r>
+      <w:r>
+        <w:t xml:space="preserve"> </w:t>
+      </w:r>
+      <w:r>
+        <w:rPr>
+          <w:bCs/>
+          <w:b/>
+        </w:rPr>
+        <w:t xml:space="preserve">b</w:t>
+      </w:r>
+      <w:r>
+        <w:t xml:space="preserve"> </w:t>
+      </w:r>
+      <w:r>
+        <w:t xml:space="preserve">is the full pipeline rather than an analysis-selection-only condition; the</w:t>
+      </w:r>
+      <w:r>
+        <w:t xml:space="preserve"> </w:t>
+      </w:r>
+      <w:r>
+        <w:t xml:space="preserve">analysis-selection-only arm described in Results holds the study pool fixed at the expert</w:t>
+      </w:r>
+      <w:r>
+        <w:t xml:space="preserve"> </w:t>
+      </w:r>
+      <w:r>
+        <w:t xml:space="preserve">inclusion list and is a separate comparison. Each</w:t>
       </w:r>
       <w:r>
         <w:t xml:space="preserve"> </w:t>

</xml_diff>